<commit_message>
docs: record v0.8.0 release commit
</commit_message>
<xml_diff>
--- a/user-docs/DeepSeek-Agent-V3-工作日志-0.8.0.docx
+++ b/user-docs/DeepSeek-Agent-V3-工作日志-0.8.0.docx
@@ -1127,16 +1127,51 @@
         <w:rPr>
           <w:rFonts w:hint="eastAsia"/>
         </w:rPr>
-        <w:t xml:space="preserve">文档同步更新。提交哈希、tag</w:t>
-      </w:r>
-      <w:r>
-        <w:t xml:space="preserve"> </w:t>
-      </w:r>
-      <w:r>
-        <w:rPr>
-          <w:rFonts w:hint="eastAsia"/>
-        </w:rPr>
-        <w:t xml:space="preserve">和远端验证结果在发布完成后补入本节。</w:t>
+        <w:t xml:space="preserve">文档同步更新。</w:t>
+      </w:r>
+    </w:p>
+    <w:p>
+      <w:pPr>
+        <w:pStyle w:val="BodyText"/>
+      </w:pPr>
+      <w:r>
+        <w:rPr>
+          <w:rFonts w:hint="eastAsia"/>
+        </w:rPr>
+        <w:t xml:space="preserve">源码提交：</w:t>
+      </w:r>
+      <w:r>
+        <w:rPr>
+          <w:rStyle w:val="VerbatimChar"/>
+        </w:rPr>
+        <w:t xml:space="preserve">ec7f55a</w:t>
+      </w:r>
+      <w:r>
+        <w:rPr>
+          <w:rFonts w:hint="eastAsia"/>
+        </w:rPr>
+        <w:t xml:space="preserve">（</w:t>
+      </w:r>
+      <w:r>
+        <w:rPr>
+          <w:rStyle w:val="VerbatimChar"/>
+        </w:rPr>
+        <w:t xml:space="preserve">release: Deep Agent v0.8.0 adaptive reasoning</w:t>
+      </w:r>
+      <w:r>
+        <w:rPr>
+          <w:rFonts w:hint="eastAsia"/>
+        </w:rPr>
+        <w:t xml:space="preserve">）。发布文档补记、tag</w:t>
+      </w:r>
+      <w:r>
+        <w:t xml:space="preserve"> </w:t>
+      </w:r>
+      <w:r>
+        <w:rPr>
+          <w:rFonts w:hint="eastAsia"/>
+        </w:rPr>
+        <w:t xml:space="preserve">和远端验证结果在最终发布提交完成后补入本节。</w:t>
       </w:r>
     </w:p>
     <w:bookmarkEnd w:id="14"/>

</xml_diff>

<commit_message>
docs: record Deep Agent v0.8.0 remote verification
</commit_message>
<xml_diff>
--- a/user-docs/DeepSeek-Agent-V3-工作日志-0.8.0.docx
+++ b/user-docs/DeepSeek-Agent-V3-工作日志-0.8.0.docx
@@ -1312,40 +1312,174 @@
         <w:rPr>
           <w:rFonts w:hint="eastAsia"/>
         </w:rPr>
-        <w:t xml:space="preserve">源码提交：</w:t>
-      </w:r>
-      <w:r>
-        <w:rPr>
-          <w:rStyle w:val="VerbatimChar"/>
-        </w:rPr>
-        <w:t xml:space="preserve">ec7f55a</w:t>
-      </w:r>
-      <w:r>
-        <w:rPr>
-          <w:rFonts w:hint="eastAsia"/>
-        </w:rPr>
-        <w:t xml:space="preserve">（</w:t>
-      </w:r>
-      <w:r>
-        <w:rPr>
-          <w:rStyle w:val="VerbatimChar"/>
-        </w:rPr>
-        <w:t xml:space="preserve">release: Deep Agent v0.8.0 adaptive reasoning</w:t>
-      </w:r>
-      <w:r>
-        <w:rPr>
-          <w:rFonts w:hint="eastAsia"/>
-        </w:rPr>
-        <w:t xml:space="preserve">）。发布文档补记、tag</w:t>
-      </w:r>
-      <w:r>
-        <w:t xml:space="preserve"> </w:t>
-      </w:r>
-      <w:r>
-        <w:rPr>
-          <w:rFonts w:hint="eastAsia"/>
-        </w:rPr>
-        <w:t xml:space="preserve">和远端验证结果在最终发布提交完成后补入本节。</w:t>
+        <w:t xml:space="preserve">正式发布提交：</w:t>
+      </w:r>
+      <w:r>
+        <w:rPr>
+          <w:rStyle w:val="VerbatimChar"/>
+        </w:rPr>
+        <w:t xml:space="preserve">1770b39</w:t>
+      </w:r>
+      <w:r>
+        <w:t xml:space="preserve">。GitHub </w:t>
+      </w:r>
+      <w:r>
+        <w:rPr>
+          <w:rFonts w:hint="eastAsia"/>
+        </w:rPr>
+        <w:t xml:space="preserve">远端</w:t>
+      </w:r>
+      <w:r>
+        <w:t xml:space="preserve"> </w:t>
+      </w:r>
+      <w:r>
+        <w:rPr>
+          <w:rStyle w:val="VerbatimChar"/>
+        </w:rPr>
+        <w:t xml:space="preserve">main</w:t>
+      </w:r>
+      <w:r>
+        <w:t xml:space="preserve"> </w:t>
+      </w:r>
+      <w:r>
+        <w:rPr>
+          <w:rFonts w:hint="eastAsia"/>
+        </w:rPr>
+        <w:t xml:space="preserve">与注释标签</w:t>
+      </w:r>
+      <w:r>
+        <w:t xml:space="preserve"> </w:t>
+      </w:r>
+      <w:r>
+        <w:rPr>
+          <w:rStyle w:val="VerbatimChar"/>
+        </w:rPr>
+        <w:t xml:space="preserve">v0.8.0</w:t>
+      </w:r>
+      <w:r>
+        <w:t xml:space="preserve"> </w:t>
+      </w:r>
+      <w:r>
+        <w:rPr>
+          <w:rFonts w:hint="eastAsia"/>
+        </w:rPr>
+        <w:t xml:space="preserve">均已核验指向完整提交</w:t>
+      </w:r>
+      <w:r>
+        <w:t xml:space="preserve"> </w:t>
+      </w:r>
+      <w:r>
+        <w:rPr>
+          <w:rStyle w:val="VerbatimChar"/>
+        </w:rPr>
+        <w:t xml:space="preserve">1770b39f83686a8b85aeb76811dbd0d568d507b4</w:t>
+      </w:r>
+      <w:r>
+        <w:t xml:space="preserve">。</w:t>
+      </w:r>
+    </w:p>
+    <w:p>
+      <w:pPr>
+        <w:pStyle w:val="BodyText"/>
+      </w:pPr>
+      <w:r>
+        <w:rPr>
+          <w:rFonts w:hint="eastAsia"/>
+        </w:rPr>
+        <w:t xml:space="preserve">推送时发现当前</w:t>
+      </w:r>
+      <w:r>
+        <w:t xml:space="preserve"> GitHub OAuth </w:t>
+      </w:r>
+      <w:r>
+        <w:rPr>
+          <w:rFonts w:hint="eastAsia"/>
+        </w:rPr>
+        <w:t xml:space="preserve">凭据只有</w:t>
+      </w:r>
+      <w:r>
+        <w:t xml:space="preserve"> </w:t>
+      </w:r>
+      <w:r>
+        <w:rPr>
+          <w:rStyle w:val="VerbatimChar"/>
+        </w:rPr>
+        <w:t xml:space="preserve">repo</w:t>
+      </w:r>
+      <w:r>
+        <w:rPr>
+          <w:rFonts w:hint="eastAsia"/>
+        </w:rPr>
+        <w:t xml:space="preserve">、没有</w:t>
+      </w:r>
+      <w:r>
+        <w:t xml:space="preserve"> </w:t>
+      </w:r>
+      <w:r>
+        <w:rPr>
+          <w:rStyle w:val="VerbatimChar"/>
+        </w:rPr>
+        <w:t xml:space="preserve">workflow</w:t>
+      </w:r>
+      <w:r>
+        <w:t xml:space="preserve"> </w:t>
+      </w:r>
+      <w:r>
+        <w:rPr>
+          <w:rFonts w:hint="eastAsia"/>
+        </w:rPr>
+        <w:t xml:space="preserve">scope，GitHub</w:t>
+      </w:r>
+      <w:r>
+        <w:t xml:space="preserve"> </w:t>
+      </w:r>
+      <w:r>
+        <w:rPr>
+          <w:rFonts w:hint="eastAsia"/>
+        </w:rPr>
+        <w:t xml:space="preserve">明确拒绝新增</w:t>
+      </w:r>
+      <w:r>
+        <w:t xml:space="preserve"> </w:t>
+      </w:r>
+      <w:r>
+        <w:rPr>
+          <w:rStyle w:val="VerbatimChar"/>
+        </w:rPr>
+        <w:t xml:space="preserve">.github/workflows/test.yml</w:t>
+      </w:r>
+      <w:r>
+        <w:rPr>
+          <w:rFonts w:hint="eastAsia"/>
+        </w:rPr>
+        <w:t xml:space="preserve">。为不阻塞源码、安全修复、测试、文档和标签发布，本轮将</w:t>
+      </w:r>
+      <w:r>
+        <w:t xml:space="preserve"> CI </w:t>
+      </w:r>
+      <w:r>
+        <w:rPr>
+          <w:rFonts w:hint="eastAsia"/>
+        </w:rPr>
+        <w:t xml:space="preserve">工作流草案留作后续改进，未在远端声称</w:t>
+      </w:r>
+      <w:r>
+        <w:t xml:space="preserve"> CI </w:t>
+      </w:r>
+      <w:r>
+        <w:rPr>
+          <w:rFonts w:hint="eastAsia"/>
+        </w:rPr>
+        <w:t xml:space="preserve">已启用；本地</w:t>
+      </w:r>
+      <w:r>
+        <w:t xml:space="preserve"> Ruff、pytest、format、compileall </w:t>
+      </w:r>
+      <w:r>
+        <w:rPr>
+          <w:rFonts w:hint="eastAsia"/>
+        </w:rPr>
+        <w:t xml:space="preserve">全部通过。</w:t>
       </w:r>
     </w:p>
     <w:bookmarkEnd w:id="14"/>

</xml_diff>

<commit_message>
docs: finalize v0.8.0 release record
</commit_message>
<xml_diff>
--- a/user-docs/DeepSeek-Agent-V3-工作日志-0.8.0.docx
+++ b/user-docs/DeepSeek-Agent-V3-工作日志-0.8.0.docx
@@ -1312,7 +1312,7 @@
         <w:rPr>
           <w:rFonts w:hint="eastAsia"/>
         </w:rPr>
-        <w:t xml:space="preserve">正式发布提交：</w:t>
+        <w:t xml:space="preserve">核心发布提交：</w:t>
       </w:r>
       <w:r>
         <w:rPr>
@@ -1321,7 +1321,13 @@
         <w:t xml:space="preserve">1770b39</w:t>
       </w:r>
       <w:r>
-        <w:t xml:space="preserve">。GitHub </w:t>
+        <w:rPr>
+          <w:rFonts w:hint="eastAsia"/>
+        </w:rPr>
+        <w:t xml:space="preserve">；后续仅追加发布核验文档。GitHub</w:t>
+      </w:r>
+      <w:r>
+        <w:t xml:space="preserve"> </w:t>
       </w:r>
       <w:r>
         <w:rPr>
@@ -1363,19 +1369,34 @@
         <w:rPr>
           <w:rFonts w:hint="eastAsia"/>
         </w:rPr>
-        <w:t xml:space="preserve">均已核验指向完整提交</w:t>
-      </w:r>
-      <w:r>
-        <w:t xml:space="preserve"> </w:t>
-      </w:r>
-      <w:r>
-        <w:rPr>
-          <w:rStyle w:val="VerbatimChar"/>
-        </w:rPr>
-        <w:t xml:space="preserve">1770b39f83686a8b85aeb76811dbd0d568d507b4</w:t>
-      </w:r>
-      <w:r>
-        <w:t xml:space="preserve">。</w:t>
+        <w:t xml:space="preserve">已在发布闭环末端通过</w:t>
+      </w:r>
+      <w:r>
+        <w:t xml:space="preserve"> </w:t>
+      </w:r>
+      <w:r>
+        <w:rPr>
+          <w:rStyle w:val="VerbatimChar"/>
+        </w:rPr>
+        <w:t xml:space="preserve">git ls-remote</w:t>
+      </w:r>
+      <w:r>
+        <w:t xml:space="preserve"> </w:t>
+      </w:r>
+      <w:r>
+        <w:rPr>
+          <w:rFonts w:hint="eastAsia"/>
+        </w:rPr>
+        <w:t xml:space="preserve">核验为同一提交；最终对象哈希以</w:t>
+      </w:r>
+      <w:r>
+        <w:t xml:space="preserve"> GitHub </w:t>
+      </w:r>
+      <w:r>
+        <w:rPr>
+          <w:rFonts w:hint="eastAsia"/>
+        </w:rPr>
+        <w:t xml:space="preserve">标签和本次最终回复为准，避免文档提交自引用造成无限追加提交。</w:t>
       </w:r>
     </w:p>
     <w:p>

</xml_diff>

<commit_message>
fix: finalize project initialization lock metadata
</commit_message>
<xml_diff>
--- a/user-docs/DeepSeek-Agent-V3-工作日志-0.8.0.docx
+++ b/user-docs/DeepSeek-Agent-V3-工作日志-0.8.0.docx
@@ -752,7 +752,7 @@
         <w:rPr>
           <w:rFonts w:hint="eastAsia"/>
         </w:rPr>
-        <w:t xml:space="preserve">新增</w:t>
+        <w:t xml:space="preserve">已生成并本地核验</w:t>
       </w:r>
       <w:r>
         <w:t xml:space="preserve"> GitHub Actions Python 3.11/3.12/3.13 </w:t>
@@ -761,19 +761,28 @@
         <w:rPr>
           <w:rFonts w:hint="eastAsia"/>
         </w:rPr>
-        <w:t xml:space="preserve">矩阵，自动执行</w:t>
-      </w:r>
-      <w:r>
-        <w:t xml:space="preserve"> Ruff、pytest </w:t>
-      </w:r>
-      <w:r>
-        <w:rPr>
-          <w:rFonts w:hint="eastAsia"/>
-        </w:rPr>
-        <w:t xml:space="preserve">和</w:t>
-      </w:r>
-      <w:r>
-        <w:t xml:space="preserve"> compileall。</w:t>
+        <w:t xml:space="preserve">矩阵；远端发布受当前凭据</w:t>
+      </w:r>
+      <w:r>
+        <w:t xml:space="preserve"> </w:t>
+      </w:r>
+      <w:r>
+        <w:rPr>
+          <w:rStyle w:val="VerbatimChar"/>
+        </w:rPr>
+        <w:t xml:space="preserve">workflow</w:t>
+      </w:r>
+      <w:r>
+        <w:t xml:space="preserve"> </w:t>
+      </w:r>
+      <w:r>
+        <w:t xml:space="preserve">scope </w:t>
+      </w:r>
+      <w:r>
+        <w:rPr>
+          <w:rFonts w:hint="eastAsia"/>
+        </w:rPr>
+        <w:t xml:space="preserve">限制，未虚报为已启用。</w:t>
       </w:r>
     </w:p>
     <w:p>

</xml_diff>